<commit_message>
Fix a mistake with cardio index creation
Also tidy up the repo a bit
</commit_message>
<xml_diff>
--- a/doc/Results.docx
+++ b/doc/Results.docx
@@ -13791,169 +13791,169 @@
                 <w:szCs w:val="22"/>
                 <w:color w:val="000000"/>
               </w:rPr>
-              <w:t xml:space="preserve">0.01 (-0.07 to 0.10)</w:t>
-            </w:r>
-          </w:p>
-        </w:tc>
-        <w:tc>
-          <w:tcPr>
-            <w:tcBorders>
-              <w:bottom w:val="none" w:sz="0" w:space="0" w:color="000000"/>
-              <w:top w:val="none" w:sz="0" w:space="0" w:color="000000"/>
-              <w:left w:val="none" w:sz="0" w:space="0" w:color="000000"/>
-              <w:right w:val="none" w:sz="0" w:space="0" w:color="000000"/>
-            </w:tcBorders>
-            <w:shd w:val="clear" w:color="auto" w:fill="FFFFFF"/>
-            <w:tcMar>
-              <w:top w:w="0" w:type="dxa"/>
-              <w:bottom w:w="0" w:type="dxa"/>
-              <w:left w:w="0" w:type="dxa"/>
-              <w:right w:w="0" w:type="dxa"/>
-            </w:tcMar>
-            <w:vAlign w:val="top"/>
-          </w:tcPr>
-          <w:p>
-            <w:pPr>
-              <w:jc w:val="center"/>
-              <w:pBdr>
-                <w:bottom w:val="none" w:sz="0" w:space="0" w:color="000000"/>
-                <w:top w:val="none" w:sz="0" w:space="0" w:color="000000"/>
-                <w:left w:val="none" w:sz="0" w:space="0" w:color="000000"/>
-                <w:right w:val="none" w:sz="0" w:space="0" w:color="000000"/>
-              </w:pBdr>
-              <w:spacing w:after="100" w:before="100" w:line="240"/>
-              <w:ind w:left="100" w:right="100" w:firstLine="0" w:firstLineChars="0"/>
-              <w:rPr>
-                <w:rFonts w:ascii="DejaVu Sans" w:hAnsi="DejaVu Sans" w:eastAsia="DejaVu Sans" w:cs="DejaVu Sans"/>
-                <w:i w:val="false"/>
-                <w:b w:val="false"/>
-                <w:u w:val="none"/>
-                <w:strike w:val="false"/>
-                <w:sz w:val="22"/>
-                <w:szCs w:val="22"/>
-                <w:color w:val="000000"/>
-              </w:rPr>
-            </w:pPr>
-            <w:r xmlns:w="http://schemas.openxmlformats.org/wordprocessingml/2006/main" xmlns:wp="http://schemas.openxmlformats.org/drawingml/2006/wordprocessingDrawing" xmlns:r="http://schemas.openxmlformats.org/officeDocument/2006/relationships" xmlns:w14="http://schemas.microsoft.com/office/word/2010/wordml">
-              <w:rPr>
-                <w:rFonts w:ascii="DejaVu Sans" w:hAnsi="DejaVu Sans" w:eastAsia="DejaVu Sans" w:cs="DejaVu Sans"/>
-                <w:i w:val="false"/>
-                <w:b w:val="false"/>
-                <w:u w:val="none"/>
-                <w:strike w:val="false"/>
-                <w:sz w:val="22"/>
-                <w:szCs w:val="22"/>
-                <w:color w:val="000000"/>
-              </w:rPr>
-              <w:t xml:space="preserve">0.80</w:t>
-            </w:r>
-          </w:p>
-        </w:tc>
-        <w:tc>
-          <w:tcPr>
-            <w:tcBorders>
-              <w:bottom w:val="none" w:sz="0" w:space="0" w:color="000000"/>
-              <w:top w:val="none" w:sz="0" w:space="0" w:color="000000"/>
-              <w:left w:val="none" w:sz="0" w:space="0" w:color="000000"/>
-              <w:right w:val="none" w:sz="0" w:space="0" w:color="000000"/>
-            </w:tcBorders>
-            <w:shd w:val="clear" w:color="auto" w:fill="FFFFFF"/>
-            <w:tcMar>
-              <w:top w:w="0" w:type="dxa"/>
-              <w:bottom w:w="0" w:type="dxa"/>
-              <w:left w:w="0" w:type="dxa"/>
-              <w:right w:w="0" w:type="dxa"/>
-            </w:tcMar>
-            <w:vAlign w:val="top"/>
-          </w:tcPr>
-          <w:p>
-            <w:pPr>
-              <w:jc w:val="center"/>
-              <w:pBdr>
-                <w:bottom w:val="none" w:sz="0" w:space="0" w:color="000000"/>
-                <w:top w:val="none" w:sz="0" w:space="0" w:color="000000"/>
-                <w:left w:val="none" w:sz="0" w:space="0" w:color="000000"/>
-                <w:right w:val="none" w:sz="0" w:space="0" w:color="000000"/>
-              </w:pBdr>
-              <w:spacing w:after="100" w:before="100" w:line="240"/>
-              <w:ind w:left="100" w:right="100" w:firstLine="0" w:firstLineChars="0"/>
-              <w:rPr>
-                <w:rFonts w:ascii="DejaVu Sans" w:hAnsi="DejaVu Sans" w:eastAsia="DejaVu Sans" w:cs="DejaVu Sans"/>
-                <w:i w:val="false"/>
-                <w:b w:val="false"/>
-                <w:u w:val="none"/>
-                <w:strike w:val="false"/>
-                <w:sz w:val="22"/>
-                <w:szCs w:val="22"/>
-                <w:color w:val="000000"/>
-              </w:rPr>
-            </w:pPr>
-            <w:r xmlns:w="http://schemas.openxmlformats.org/wordprocessingml/2006/main" xmlns:wp="http://schemas.openxmlformats.org/drawingml/2006/wordprocessingDrawing" xmlns:r="http://schemas.openxmlformats.org/officeDocument/2006/relationships" xmlns:w14="http://schemas.microsoft.com/office/word/2010/wordml">
-              <w:rPr>
-                <w:rFonts w:ascii="DejaVu Sans" w:hAnsi="DejaVu Sans" w:eastAsia="DejaVu Sans" w:cs="DejaVu Sans"/>
-                <w:i w:val="false"/>
-                <w:b w:val="false"/>
-                <w:u w:val="none"/>
-                <w:strike w:val="false"/>
-                <w:sz w:val="22"/>
-                <w:szCs w:val="22"/>
-                <w:color w:val="000000"/>
-              </w:rPr>
-              <w:t xml:space="preserve">0.01 (-0.09 to 0.11)</w:t>
-            </w:r>
-          </w:p>
-        </w:tc>
-        <w:tc>
-          <w:tcPr>
-            <w:tcBorders>
-              <w:bottom w:val="none" w:sz="0" w:space="0" w:color="000000"/>
-              <w:top w:val="none" w:sz="0" w:space="0" w:color="000000"/>
-              <w:left w:val="none" w:sz="0" w:space="0" w:color="000000"/>
-              <w:right w:val="none" w:sz="0" w:space="0" w:color="000000"/>
-            </w:tcBorders>
-            <w:shd w:val="clear" w:color="auto" w:fill="FFFFFF"/>
-            <w:tcMar>
-              <w:top w:w="0" w:type="dxa"/>
-              <w:bottom w:w="0" w:type="dxa"/>
-              <w:left w:w="0" w:type="dxa"/>
-              <w:right w:w="0" w:type="dxa"/>
-            </w:tcMar>
-            <w:vAlign w:val="top"/>
-          </w:tcPr>
-          <w:p>
-            <w:pPr>
-              <w:jc w:val="center"/>
-              <w:pBdr>
-                <w:bottom w:val="none" w:sz="0" w:space="0" w:color="000000"/>
-                <w:top w:val="none" w:sz="0" w:space="0" w:color="000000"/>
-                <w:left w:val="none" w:sz="0" w:space="0" w:color="000000"/>
-                <w:right w:val="none" w:sz="0" w:space="0" w:color="000000"/>
-              </w:pBdr>
-              <w:spacing w:after="100" w:before="100" w:line="240"/>
-              <w:ind w:left="100" w:right="100" w:firstLine="0" w:firstLineChars="0"/>
-              <w:rPr>
-                <w:rFonts w:ascii="DejaVu Sans" w:hAnsi="DejaVu Sans" w:eastAsia="DejaVu Sans" w:cs="DejaVu Sans"/>
-                <w:i w:val="false"/>
-                <w:b w:val="false"/>
-                <w:u w:val="none"/>
-                <w:strike w:val="false"/>
-                <w:sz w:val="22"/>
-                <w:szCs w:val="22"/>
-                <w:color w:val="000000"/>
-              </w:rPr>
-            </w:pPr>
-            <w:r xmlns:w="http://schemas.openxmlformats.org/wordprocessingml/2006/main" xmlns:wp="http://schemas.openxmlformats.org/drawingml/2006/wordprocessingDrawing" xmlns:r="http://schemas.openxmlformats.org/officeDocument/2006/relationships" xmlns:w14="http://schemas.microsoft.com/office/word/2010/wordml">
-              <w:rPr>
-                <w:rFonts w:ascii="DejaVu Sans" w:hAnsi="DejaVu Sans" w:eastAsia="DejaVu Sans" w:cs="DejaVu Sans"/>
-                <w:i w:val="false"/>
-                <w:b w:val="false"/>
-                <w:u w:val="none"/>
-                <w:strike w:val="false"/>
-                <w:sz w:val="22"/>
-                <w:szCs w:val="22"/>
-                <w:color w:val="000000"/>
-              </w:rPr>
-              <w:t xml:space="preserve">0.88</w:t>
+              <w:t xml:space="preserve">0.03 (-0.04 to 0.09)</w:t>
+            </w:r>
+          </w:p>
+        </w:tc>
+        <w:tc>
+          <w:tcPr>
+            <w:tcBorders>
+              <w:bottom w:val="none" w:sz="0" w:space="0" w:color="000000"/>
+              <w:top w:val="none" w:sz="0" w:space="0" w:color="000000"/>
+              <w:left w:val="none" w:sz="0" w:space="0" w:color="000000"/>
+              <w:right w:val="none" w:sz="0" w:space="0" w:color="000000"/>
+            </w:tcBorders>
+            <w:shd w:val="clear" w:color="auto" w:fill="FFFFFF"/>
+            <w:tcMar>
+              <w:top w:w="0" w:type="dxa"/>
+              <w:bottom w:w="0" w:type="dxa"/>
+              <w:left w:w="0" w:type="dxa"/>
+              <w:right w:w="0" w:type="dxa"/>
+            </w:tcMar>
+            <w:vAlign w:val="top"/>
+          </w:tcPr>
+          <w:p>
+            <w:pPr>
+              <w:jc w:val="center"/>
+              <w:pBdr>
+                <w:bottom w:val="none" w:sz="0" w:space="0" w:color="000000"/>
+                <w:top w:val="none" w:sz="0" w:space="0" w:color="000000"/>
+                <w:left w:val="none" w:sz="0" w:space="0" w:color="000000"/>
+                <w:right w:val="none" w:sz="0" w:space="0" w:color="000000"/>
+              </w:pBdr>
+              <w:spacing w:after="100" w:before="100" w:line="240"/>
+              <w:ind w:left="100" w:right="100" w:firstLine="0" w:firstLineChars="0"/>
+              <w:rPr>
+                <w:rFonts w:ascii="DejaVu Sans" w:hAnsi="DejaVu Sans" w:eastAsia="DejaVu Sans" w:cs="DejaVu Sans"/>
+                <w:i w:val="false"/>
+                <w:b w:val="false"/>
+                <w:u w:val="none"/>
+                <w:strike w:val="false"/>
+                <w:sz w:val="22"/>
+                <w:szCs w:val="22"/>
+                <w:color w:val="000000"/>
+              </w:rPr>
+            </w:pPr>
+            <w:r xmlns:w="http://schemas.openxmlformats.org/wordprocessingml/2006/main" xmlns:wp="http://schemas.openxmlformats.org/drawingml/2006/wordprocessingDrawing" xmlns:r="http://schemas.openxmlformats.org/officeDocument/2006/relationships" xmlns:w14="http://schemas.microsoft.com/office/word/2010/wordml">
+              <w:rPr>
+                <w:rFonts w:ascii="DejaVu Sans" w:hAnsi="DejaVu Sans" w:eastAsia="DejaVu Sans" w:cs="DejaVu Sans"/>
+                <w:i w:val="false"/>
+                <w:b w:val="false"/>
+                <w:u w:val="none"/>
+                <w:strike w:val="false"/>
+                <w:sz w:val="22"/>
+                <w:szCs w:val="22"/>
+                <w:color w:val="000000"/>
+              </w:rPr>
+              <w:t xml:space="preserve">0.41</w:t>
+            </w:r>
+          </w:p>
+        </w:tc>
+        <w:tc>
+          <w:tcPr>
+            <w:tcBorders>
+              <w:bottom w:val="none" w:sz="0" w:space="0" w:color="000000"/>
+              <w:top w:val="none" w:sz="0" w:space="0" w:color="000000"/>
+              <w:left w:val="none" w:sz="0" w:space="0" w:color="000000"/>
+              <w:right w:val="none" w:sz="0" w:space="0" w:color="000000"/>
+            </w:tcBorders>
+            <w:shd w:val="clear" w:color="auto" w:fill="FFFFFF"/>
+            <w:tcMar>
+              <w:top w:w="0" w:type="dxa"/>
+              <w:bottom w:w="0" w:type="dxa"/>
+              <w:left w:w="0" w:type="dxa"/>
+              <w:right w:w="0" w:type="dxa"/>
+            </w:tcMar>
+            <w:vAlign w:val="top"/>
+          </w:tcPr>
+          <w:p>
+            <w:pPr>
+              <w:jc w:val="center"/>
+              <w:pBdr>
+                <w:bottom w:val="none" w:sz="0" w:space="0" w:color="000000"/>
+                <w:top w:val="none" w:sz="0" w:space="0" w:color="000000"/>
+                <w:left w:val="none" w:sz="0" w:space="0" w:color="000000"/>
+                <w:right w:val="none" w:sz="0" w:space="0" w:color="000000"/>
+              </w:pBdr>
+              <w:spacing w:after="100" w:before="100" w:line="240"/>
+              <w:ind w:left="100" w:right="100" w:firstLine="0" w:firstLineChars="0"/>
+              <w:rPr>
+                <w:rFonts w:ascii="DejaVu Sans" w:hAnsi="DejaVu Sans" w:eastAsia="DejaVu Sans" w:cs="DejaVu Sans"/>
+                <w:i w:val="false"/>
+                <w:b w:val="false"/>
+                <w:u w:val="none"/>
+                <w:strike w:val="false"/>
+                <w:sz w:val="22"/>
+                <w:szCs w:val="22"/>
+                <w:color w:val="000000"/>
+              </w:rPr>
+            </w:pPr>
+            <w:r xmlns:w="http://schemas.openxmlformats.org/wordprocessingml/2006/main" xmlns:wp="http://schemas.openxmlformats.org/drawingml/2006/wordprocessingDrawing" xmlns:r="http://schemas.openxmlformats.org/officeDocument/2006/relationships" xmlns:w14="http://schemas.microsoft.com/office/word/2010/wordml">
+              <w:rPr>
+                <w:rFonts w:ascii="DejaVu Sans" w:hAnsi="DejaVu Sans" w:eastAsia="DejaVu Sans" w:cs="DejaVu Sans"/>
+                <w:i w:val="false"/>
+                <w:b w:val="false"/>
+                <w:u w:val="none"/>
+                <w:strike w:val="false"/>
+                <w:sz w:val="22"/>
+                <w:szCs w:val="22"/>
+                <w:color w:val="000000"/>
+              </w:rPr>
+              <w:t xml:space="preserve">0.02 (-0.06 to 0.10)</w:t>
+            </w:r>
+          </w:p>
+        </w:tc>
+        <w:tc>
+          <w:tcPr>
+            <w:tcBorders>
+              <w:bottom w:val="none" w:sz="0" w:space="0" w:color="000000"/>
+              <w:top w:val="none" w:sz="0" w:space="0" w:color="000000"/>
+              <w:left w:val="none" w:sz="0" w:space="0" w:color="000000"/>
+              <w:right w:val="none" w:sz="0" w:space="0" w:color="000000"/>
+            </w:tcBorders>
+            <w:shd w:val="clear" w:color="auto" w:fill="FFFFFF"/>
+            <w:tcMar>
+              <w:top w:w="0" w:type="dxa"/>
+              <w:bottom w:w="0" w:type="dxa"/>
+              <w:left w:w="0" w:type="dxa"/>
+              <w:right w:w="0" w:type="dxa"/>
+            </w:tcMar>
+            <w:vAlign w:val="top"/>
+          </w:tcPr>
+          <w:p>
+            <w:pPr>
+              <w:jc w:val="center"/>
+              <w:pBdr>
+                <w:bottom w:val="none" w:sz="0" w:space="0" w:color="000000"/>
+                <w:top w:val="none" w:sz="0" w:space="0" w:color="000000"/>
+                <w:left w:val="none" w:sz="0" w:space="0" w:color="000000"/>
+                <w:right w:val="none" w:sz="0" w:space="0" w:color="000000"/>
+              </w:pBdr>
+              <w:spacing w:after="100" w:before="100" w:line="240"/>
+              <w:ind w:left="100" w:right="100" w:firstLine="0" w:firstLineChars="0"/>
+              <w:rPr>
+                <w:rFonts w:ascii="DejaVu Sans" w:hAnsi="DejaVu Sans" w:eastAsia="DejaVu Sans" w:cs="DejaVu Sans"/>
+                <w:i w:val="false"/>
+                <w:b w:val="false"/>
+                <w:u w:val="none"/>
+                <w:strike w:val="false"/>
+                <w:sz w:val="22"/>
+                <w:szCs w:val="22"/>
+                <w:color w:val="000000"/>
+              </w:rPr>
+            </w:pPr>
+            <w:r xmlns:w="http://schemas.openxmlformats.org/wordprocessingml/2006/main" xmlns:wp="http://schemas.openxmlformats.org/drawingml/2006/wordprocessingDrawing" xmlns:r="http://schemas.openxmlformats.org/officeDocument/2006/relationships" xmlns:w14="http://schemas.microsoft.com/office/word/2010/wordml">
+              <w:rPr>
+                <w:rFonts w:ascii="DejaVu Sans" w:hAnsi="DejaVu Sans" w:eastAsia="DejaVu Sans" w:cs="DejaVu Sans"/>
+                <w:i w:val="false"/>
+                <w:b w:val="false"/>
+                <w:u w:val="none"/>
+                <w:strike w:val="false"/>
+                <w:sz w:val="22"/>
+                <w:szCs w:val="22"/>
+                <w:color w:val="000000"/>
+              </w:rPr>
+              <w:t xml:space="preserve">0.60</w:t>
             </w:r>
           </w:p>
         </w:tc>
@@ -14066,169 +14066,169 @@
                 <w:szCs w:val="22"/>
                 <w:color w:val="000000"/>
               </w:rPr>
-              <w:t xml:space="preserve">0.11 (-0.17 to 0.40)</w:t>
-            </w:r>
-          </w:p>
-        </w:tc>
-        <w:tc>
-          <w:tcPr>
-            <w:tcBorders>
-              <w:bottom w:val="none" w:sz="0" w:space="0" w:color="000000"/>
-              <w:top w:val="none" w:sz="0" w:space="0" w:color="000000"/>
-              <w:left w:val="none" w:sz="0" w:space="0" w:color="000000"/>
-              <w:right w:val="none" w:sz="0" w:space="0" w:color="000000"/>
-            </w:tcBorders>
-            <w:shd w:val="clear" w:color="auto" w:fill="FFFFFF"/>
-            <w:tcMar>
-              <w:top w:w="0" w:type="dxa"/>
-              <w:bottom w:w="0" w:type="dxa"/>
-              <w:left w:w="0" w:type="dxa"/>
-              <w:right w:w="0" w:type="dxa"/>
-            </w:tcMar>
-            <w:vAlign w:val="top"/>
-          </w:tcPr>
-          <w:p>
-            <w:pPr>
-              <w:jc w:val="center"/>
-              <w:pBdr>
-                <w:bottom w:val="none" w:sz="0" w:space="0" w:color="000000"/>
-                <w:top w:val="none" w:sz="0" w:space="0" w:color="000000"/>
-                <w:left w:val="none" w:sz="0" w:space="0" w:color="000000"/>
-                <w:right w:val="none" w:sz="0" w:space="0" w:color="000000"/>
-              </w:pBdr>
-              <w:spacing w:after="100" w:before="100" w:line="240"/>
-              <w:ind w:left="100" w:right="100" w:firstLine="0" w:firstLineChars="0"/>
-              <w:rPr>
-                <w:rFonts w:ascii="DejaVu Sans" w:hAnsi="DejaVu Sans" w:eastAsia="DejaVu Sans" w:cs="DejaVu Sans"/>
-                <w:i w:val="false"/>
-                <w:b w:val="false"/>
-                <w:u w:val="none"/>
-                <w:strike w:val="false"/>
-                <w:sz w:val="22"/>
-                <w:szCs w:val="22"/>
-                <w:color w:val="000000"/>
-              </w:rPr>
-            </w:pPr>
-            <w:r xmlns:w="http://schemas.openxmlformats.org/wordprocessingml/2006/main" xmlns:wp="http://schemas.openxmlformats.org/drawingml/2006/wordprocessingDrawing" xmlns:r="http://schemas.openxmlformats.org/officeDocument/2006/relationships" xmlns:w14="http://schemas.microsoft.com/office/word/2010/wordml">
-              <w:rPr>
-                <w:rFonts w:ascii="DejaVu Sans" w:hAnsi="DejaVu Sans" w:eastAsia="DejaVu Sans" w:cs="DejaVu Sans"/>
-                <w:i w:val="false"/>
-                <w:b w:val="false"/>
-                <w:u w:val="none"/>
-                <w:strike w:val="false"/>
-                <w:sz w:val="22"/>
-                <w:szCs w:val="22"/>
-                <w:color w:val="000000"/>
-              </w:rPr>
-              <w:t xml:space="preserve">0.44</w:t>
-            </w:r>
-          </w:p>
-        </w:tc>
-        <w:tc>
-          <w:tcPr>
-            <w:tcBorders>
-              <w:bottom w:val="none" w:sz="0" w:space="0" w:color="000000"/>
-              <w:top w:val="none" w:sz="0" w:space="0" w:color="000000"/>
-              <w:left w:val="none" w:sz="0" w:space="0" w:color="000000"/>
-              <w:right w:val="none" w:sz="0" w:space="0" w:color="000000"/>
-            </w:tcBorders>
-            <w:shd w:val="clear" w:color="auto" w:fill="FFFFFF"/>
-            <w:tcMar>
-              <w:top w:w="0" w:type="dxa"/>
-              <w:bottom w:w="0" w:type="dxa"/>
-              <w:left w:w="0" w:type="dxa"/>
-              <w:right w:w="0" w:type="dxa"/>
-            </w:tcMar>
-            <w:vAlign w:val="top"/>
-          </w:tcPr>
-          <w:p>
-            <w:pPr>
-              <w:jc w:val="center"/>
-              <w:pBdr>
-                <w:bottom w:val="none" w:sz="0" w:space="0" w:color="000000"/>
-                <w:top w:val="none" w:sz="0" w:space="0" w:color="000000"/>
-                <w:left w:val="none" w:sz="0" w:space="0" w:color="000000"/>
-                <w:right w:val="none" w:sz="0" w:space="0" w:color="000000"/>
-              </w:pBdr>
-              <w:spacing w:after="100" w:before="100" w:line="240"/>
-              <w:ind w:left="100" w:right="100" w:firstLine="0" w:firstLineChars="0"/>
-              <w:rPr>
-                <w:rFonts w:ascii="DejaVu Sans" w:hAnsi="DejaVu Sans" w:eastAsia="DejaVu Sans" w:cs="DejaVu Sans"/>
-                <w:i w:val="false"/>
-                <w:b w:val="false"/>
-                <w:u w:val="none"/>
-                <w:strike w:val="false"/>
-                <w:sz w:val="22"/>
-                <w:szCs w:val="22"/>
-                <w:color w:val="000000"/>
-              </w:rPr>
-            </w:pPr>
-            <w:r xmlns:w="http://schemas.openxmlformats.org/wordprocessingml/2006/main" xmlns:wp="http://schemas.openxmlformats.org/drawingml/2006/wordprocessingDrawing" xmlns:r="http://schemas.openxmlformats.org/officeDocument/2006/relationships" xmlns:w14="http://schemas.microsoft.com/office/word/2010/wordml">
-              <w:rPr>
-                <w:rFonts w:ascii="DejaVu Sans" w:hAnsi="DejaVu Sans" w:eastAsia="DejaVu Sans" w:cs="DejaVu Sans"/>
-                <w:i w:val="false"/>
-                <w:b w:val="false"/>
-                <w:u w:val="none"/>
-                <w:strike w:val="false"/>
-                <w:sz w:val="22"/>
-                <w:szCs w:val="22"/>
-                <w:color w:val="000000"/>
-              </w:rPr>
-              <w:t xml:space="preserve">0.19 (-0.23 to 0.61)</w:t>
-            </w:r>
-          </w:p>
-        </w:tc>
-        <w:tc>
-          <w:tcPr>
-            <w:tcBorders>
-              <w:bottom w:val="none" w:sz="0" w:space="0" w:color="000000"/>
-              <w:top w:val="none" w:sz="0" w:space="0" w:color="000000"/>
-              <w:left w:val="none" w:sz="0" w:space="0" w:color="000000"/>
-              <w:right w:val="none" w:sz="0" w:space="0" w:color="000000"/>
-            </w:tcBorders>
-            <w:shd w:val="clear" w:color="auto" w:fill="FFFFFF"/>
-            <w:tcMar>
-              <w:top w:w="0" w:type="dxa"/>
-              <w:bottom w:w="0" w:type="dxa"/>
-              <w:left w:w="0" w:type="dxa"/>
-              <w:right w:w="0" w:type="dxa"/>
-            </w:tcMar>
-            <w:vAlign w:val="top"/>
-          </w:tcPr>
-          <w:p>
-            <w:pPr>
-              <w:jc w:val="center"/>
-              <w:pBdr>
-                <w:bottom w:val="none" w:sz="0" w:space="0" w:color="000000"/>
-                <w:top w:val="none" w:sz="0" w:space="0" w:color="000000"/>
-                <w:left w:val="none" w:sz="0" w:space="0" w:color="000000"/>
-                <w:right w:val="none" w:sz="0" w:space="0" w:color="000000"/>
-              </w:pBdr>
-              <w:spacing w:after="100" w:before="100" w:line="240"/>
-              <w:ind w:left="100" w:right="100" w:firstLine="0" w:firstLineChars="0"/>
-              <w:rPr>
-                <w:rFonts w:ascii="DejaVu Sans" w:hAnsi="DejaVu Sans" w:eastAsia="DejaVu Sans" w:cs="DejaVu Sans"/>
-                <w:i w:val="false"/>
-                <w:b w:val="false"/>
-                <w:u w:val="none"/>
-                <w:strike w:val="false"/>
-                <w:sz w:val="22"/>
-                <w:szCs w:val="22"/>
-                <w:color w:val="000000"/>
-              </w:rPr>
-            </w:pPr>
-            <w:r xmlns:w="http://schemas.openxmlformats.org/wordprocessingml/2006/main" xmlns:wp="http://schemas.openxmlformats.org/drawingml/2006/wordprocessingDrawing" xmlns:r="http://schemas.openxmlformats.org/officeDocument/2006/relationships" xmlns:w14="http://schemas.microsoft.com/office/word/2010/wordml">
-              <w:rPr>
-                <w:rFonts w:ascii="DejaVu Sans" w:hAnsi="DejaVu Sans" w:eastAsia="DejaVu Sans" w:cs="DejaVu Sans"/>
-                <w:i w:val="false"/>
-                <w:b w:val="false"/>
-                <w:u w:val="none"/>
-                <w:strike w:val="false"/>
-                <w:sz w:val="22"/>
-                <w:szCs w:val="22"/>
-                <w:color w:val="000000"/>
-              </w:rPr>
-              <w:t xml:space="preserve">0.37</w:t>
+              <w:t xml:space="preserve">0.25 (0.03 to 0.47)</w:t>
+            </w:r>
+          </w:p>
+        </w:tc>
+        <w:tc>
+          <w:tcPr>
+            <w:tcBorders>
+              <w:bottom w:val="none" w:sz="0" w:space="0" w:color="000000"/>
+              <w:top w:val="none" w:sz="0" w:space="0" w:color="000000"/>
+              <w:left w:val="none" w:sz="0" w:space="0" w:color="000000"/>
+              <w:right w:val="none" w:sz="0" w:space="0" w:color="000000"/>
+            </w:tcBorders>
+            <w:shd w:val="clear" w:color="auto" w:fill="FFFFFF"/>
+            <w:tcMar>
+              <w:top w:w="0" w:type="dxa"/>
+              <w:bottom w:w="0" w:type="dxa"/>
+              <w:left w:w="0" w:type="dxa"/>
+              <w:right w:w="0" w:type="dxa"/>
+            </w:tcMar>
+            <w:vAlign w:val="top"/>
+          </w:tcPr>
+          <w:p>
+            <w:pPr>
+              <w:jc w:val="center"/>
+              <w:pBdr>
+                <w:bottom w:val="none" w:sz="0" w:space="0" w:color="000000"/>
+                <w:top w:val="none" w:sz="0" w:space="0" w:color="000000"/>
+                <w:left w:val="none" w:sz="0" w:space="0" w:color="000000"/>
+                <w:right w:val="none" w:sz="0" w:space="0" w:color="000000"/>
+              </w:pBdr>
+              <w:spacing w:after="100" w:before="100" w:line="240"/>
+              <w:ind w:left="100" w:right="100" w:firstLine="0" w:firstLineChars="0"/>
+              <w:rPr>
+                <w:rFonts w:ascii="DejaVu Sans" w:hAnsi="DejaVu Sans" w:eastAsia="DejaVu Sans" w:cs="DejaVu Sans"/>
+                <w:i w:val="false"/>
+                <w:b w:val="true"/>
+                <w:u w:val="none"/>
+                <w:strike w:val="false"/>
+                <w:sz w:val="22"/>
+                <w:szCs w:val="22"/>
+                <w:color w:val="000000"/>
+              </w:rPr>
+            </w:pPr>
+            <w:r xmlns:w="http://schemas.openxmlformats.org/wordprocessingml/2006/main" xmlns:wp="http://schemas.openxmlformats.org/drawingml/2006/wordprocessingDrawing" xmlns:r="http://schemas.openxmlformats.org/officeDocument/2006/relationships" xmlns:w14="http://schemas.microsoft.com/office/word/2010/wordml">
+              <w:rPr>
+                <w:rFonts w:ascii="DejaVu Sans" w:hAnsi="DejaVu Sans" w:eastAsia="DejaVu Sans" w:cs="DejaVu Sans"/>
+                <w:i w:val="false"/>
+                <w:b w:val="true"/>
+                <w:u w:val="none"/>
+                <w:strike w:val="false"/>
+                <w:sz w:val="22"/>
+                <w:szCs w:val="22"/>
+                <w:color w:val="000000"/>
+              </w:rPr>
+              <w:t xml:space="preserve">0.027</w:t>
+            </w:r>
+          </w:p>
+        </w:tc>
+        <w:tc>
+          <w:tcPr>
+            <w:tcBorders>
+              <w:bottom w:val="none" w:sz="0" w:space="0" w:color="000000"/>
+              <w:top w:val="none" w:sz="0" w:space="0" w:color="000000"/>
+              <w:left w:val="none" w:sz="0" w:space="0" w:color="000000"/>
+              <w:right w:val="none" w:sz="0" w:space="0" w:color="000000"/>
+            </w:tcBorders>
+            <w:shd w:val="clear" w:color="auto" w:fill="FFFFFF"/>
+            <w:tcMar>
+              <w:top w:w="0" w:type="dxa"/>
+              <w:bottom w:w="0" w:type="dxa"/>
+              <w:left w:w="0" w:type="dxa"/>
+              <w:right w:w="0" w:type="dxa"/>
+            </w:tcMar>
+            <w:vAlign w:val="top"/>
+          </w:tcPr>
+          <w:p>
+            <w:pPr>
+              <w:jc w:val="center"/>
+              <w:pBdr>
+                <w:bottom w:val="none" w:sz="0" w:space="0" w:color="000000"/>
+                <w:top w:val="none" w:sz="0" w:space="0" w:color="000000"/>
+                <w:left w:val="none" w:sz="0" w:space="0" w:color="000000"/>
+                <w:right w:val="none" w:sz="0" w:space="0" w:color="000000"/>
+              </w:pBdr>
+              <w:spacing w:after="100" w:before="100" w:line="240"/>
+              <w:ind w:left="100" w:right="100" w:firstLine="0" w:firstLineChars="0"/>
+              <w:rPr>
+                <w:rFonts w:ascii="DejaVu Sans" w:hAnsi="DejaVu Sans" w:eastAsia="DejaVu Sans" w:cs="DejaVu Sans"/>
+                <w:i w:val="false"/>
+                <w:b w:val="false"/>
+                <w:u w:val="none"/>
+                <w:strike w:val="false"/>
+                <w:sz w:val="22"/>
+                <w:szCs w:val="22"/>
+                <w:color w:val="000000"/>
+              </w:rPr>
+            </w:pPr>
+            <w:r xmlns:w="http://schemas.openxmlformats.org/wordprocessingml/2006/main" xmlns:wp="http://schemas.openxmlformats.org/drawingml/2006/wordprocessingDrawing" xmlns:r="http://schemas.openxmlformats.org/officeDocument/2006/relationships" xmlns:w14="http://schemas.microsoft.com/office/word/2010/wordml">
+              <w:rPr>
+                <w:rFonts w:ascii="DejaVu Sans" w:hAnsi="DejaVu Sans" w:eastAsia="DejaVu Sans" w:cs="DejaVu Sans"/>
+                <w:i w:val="false"/>
+                <w:b w:val="false"/>
+                <w:u w:val="none"/>
+                <w:strike w:val="false"/>
+                <w:sz w:val="22"/>
+                <w:szCs w:val="22"/>
+                <w:color w:val="000000"/>
+              </w:rPr>
+              <w:t xml:space="preserve">0.28 (-0.06 to 0.63)</w:t>
+            </w:r>
+          </w:p>
+        </w:tc>
+        <w:tc>
+          <w:tcPr>
+            <w:tcBorders>
+              <w:bottom w:val="none" w:sz="0" w:space="0" w:color="000000"/>
+              <w:top w:val="none" w:sz="0" w:space="0" w:color="000000"/>
+              <w:left w:val="none" w:sz="0" w:space="0" w:color="000000"/>
+              <w:right w:val="none" w:sz="0" w:space="0" w:color="000000"/>
+            </w:tcBorders>
+            <w:shd w:val="clear" w:color="auto" w:fill="FFFFFF"/>
+            <w:tcMar>
+              <w:top w:w="0" w:type="dxa"/>
+              <w:bottom w:w="0" w:type="dxa"/>
+              <w:left w:w="0" w:type="dxa"/>
+              <w:right w:w="0" w:type="dxa"/>
+            </w:tcMar>
+            <w:vAlign w:val="top"/>
+          </w:tcPr>
+          <w:p>
+            <w:pPr>
+              <w:jc w:val="center"/>
+              <w:pBdr>
+                <w:bottom w:val="none" w:sz="0" w:space="0" w:color="000000"/>
+                <w:top w:val="none" w:sz="0" w:space="0" w:color="000000"/>
+                <w:left w:val="none" w:sz="0" w:space="0" w:color="000000"/>
+                <w:right w:val="none" w:sz="0" w:space="0" w:color="000000"/>
+              </w:pBdr>
+              <w:spacing w:after="100" w:before="100" w:line="240"/>
+              <w:ind w:left="100" w:right="100" w:firstLine="0" w:firstLineChars="0"/>
+              <w:rPr>
+                <w:rFonts w:ascii="DejaVu Sans" w:hAnsi="DejaVu Sans" w:eastAsia="DejaVu Sans" w:cs="DejaVu Sans"/>
+                <w:i w:val="false"/>
+                <w:b w:val="false"/>
+                <w:u w:val="none"/>
+                <w:strike w:val="false"/>
+                <w:sz w:val="22"/>
+                <w:szCs w:val="22"/>
+                <w:color w:val="000000"/>
+              </w:rPr>
+            </w:pPr>
+            <w:r xmlns:w="http://schemas.openxmlformats.org/wordprocessingml/2006/main" xmlns:wp="http://schemas.openxmlformats.org/drawingml/2006/wordprocessingDrawing" xmlns:r="http://schemas.openxmlformats.org/officeDocument/2006/relationships" xmlns:w14="http://schemas.microsoft.com/office/word/2010/wordml">
+              <w:rPr>
+                <w:rFonts w:ascii="DejaVu Sans" w:hAnsi="DejaVu Sans" w:eastAsia="DejaVu Sans" w:cs="DejaVu Sans"/>
+                <w:i w:val="false"/>
+                <w:b w:val="false"/>
+                <w:u w:val="none"/>
+                <w:strike w:val="false"/>
+                <w:sz w:val="22"/>
+                <w:szCs w:val="22"/>
+                <w:color w:val="000000"/>
+              </w:rPr>
+              <w:t xml:space="preserve">0.11</w:t>
             </w:r>
           </w:p>
         </w:tc>
@@ -14449,7 +14449,7 @@
                 <w:szCs w:val="22"/>
                 <w:color w:val="000000"/>
               </w:rPr>
-              <w:t xml:space="preserve">-0.09 (-0.15 to -0.03)</w:t>
+              <w:t xml:space="preserve">-0.10 (-0.15 to -0.05)</w:t>
             </w:r>
           </w:p>
         </w:tc>
@@ -14503,7 +14503,7 @@
                 <w:szCs w:val="22"/>
                 <w:color w:val="000000"/>
               </w:rPr>
-              <w:t xml:space="preserve">0.003</w:t>
+              <w:t xml:space="preserve">&lt;0.001</w:t>
             </w:r>
           </w:p>
         </w:tc>
@@ -14724,61 +14724,61 @@
                 <w:szCs w:val="22"/>
                 <w:color w:val="000000"/>
               </w:rPr>
-              <w:t xml:space="preserve">-0.01 (-0.07 to 0.05)</w:t>
-            </w:r>
-          </w:p>
-        </w:tc>
-        <w:tc>
-          <w:tcPr>
-            <w:tcBorders>
-              <w:bottom w:val="none" w:sz="0" w:space="0" w:color="000000"/>
-              <w:top w:val="none" w:sz="0" w:space="0" w:color="000000"/>
-              <w:left w:val="none" w:sz="0" w:space="0" w:color="000000"/>
-              <w:right w:val="none" w:sz="0" w:space="0" w:color="000000"/>
-            </w:tcBorders>
-            <w:shd w:val="clear" w:color="auto" w:fill="FFFFFF"/>
-            <w:tcMar>
-              <w:top w:w="0" w:type="dxa"/>
-              <w:bottom w:w="0" w:type="dxa"/>
-              <w:left w:w="0" w:type="dxa"/>
-              <w:right w:w="0" w:type="dxa"/>
-            </w:tcMar>
-            <w:vAlign w:val="top"/>
-          </w:tcPr>
-          <w:p>
-            <w:pPr>
-              <w:jc w:val="center"/>
-              <w:pBdr>
-                <w:bottom w:val="none" w:sz="0" w:space="0" w:color="000000"/>
-                <w:top w:val="none" w:sz="0" w:space="0" w:color="000000"/>
-                <w:left w:val="none" w:sz="0" w:space="0" w:color="000000"/>
-                <w:right w:val="none" w:sz="0" w:space="0" w:color="000000"/>
-              </w:pBdr>
-              <w:spacing w:after="100" w:before="100" w:line="240"/>
-              <w:ind w:left="100" w:right="100" w:firstLine="0" w:firstLineChars="0"/>
-              <w:rPr>
-                <w:rFonts w:ascii="DejaVu Sans" w:hAnsi="DejaVu Sans" w:eastAsia="DejaVu Sans" w:cs="DejaVu Sans"/>
-                <w:i w:val="false"/>
-                <w:b w:val="false"/>
-                <w:u w:val="none"/>
-                <w:strike w:val="false"/>
-                <w:sz w:val="22"/>
-                <w:szCs w:val="22"/>
-                <w:color w:val="000000"/>
-              </w:rPr>
-            </w:pPr>
-            <w:r xmlns:w="http://schemas.openxmlformats.org/wordprocessingml/2006/main" xmlns:wp="http://schemas.openxmlformats.org/drawingml/2006/wordprocessingDrawing" xmlns:r="http://schemas.openxmlformats.org/officeDocument/2006/relationships" xmlns:w14="http://schemas.microsoft.com/office/word/2010/wordml">
-              <w:rPr>
-                <w:rFonts w:ascii="DejaVu Sans" w:hAnsi="DejaVu Sans" w:eastAsia="DejaVu Sans" w:cs="DejaVu Sans"/>
-                <w:i w:val="false"/>
-                <w:b w:val="false"/>
-                <w:u w:val="none"/>
-                <w:strike w:val="false"/>
-                <w:sz w:val="22"/>
-                <w:szCs w:val="22"/>
-                <w:color w:val="000000"/>
-              </w:rPr>
-              <w:t xml:space="preserve">0.81</w:t>
+              <w:t xml:space="preserve">-0.01 (-0.06 to 0.04)</w:t>
+            </w:r>
+          </w:p>
+        </w:tc>
+        <w:tc>
+          <w:tcPr>
+            <w:tcBorders>
+              <w:bottom w:val="none" w:sz="0" w:space="0" w:color="000000"/>
+              <w:top w:val="none" w:sz="0" w:space="0" w:color="000000"/>
+              <w:left w:val="none" w:sz="0" w:space="0" w:color="000000"/>
+              <w:right w:val="none" w:sz="0" w:space="0" w:color="000000"/>
+            </w:tcBorders>
+            <w:shd w:val="clear" w:color="auto" w:fill="FFFFFF"/>
+            <w:tcMar>
+              <w:top w:w="0" w:type="dxa"/>
+              <w:bottom w:w="0" w:type="dxa"/>
+              <w:left w:w="0" w:type="dxa"/>
+              <w:right w:w="0" w:type="dxa"/>
+            </w:tcMar>
+            <w:vAlign w:val="top"/>
+          </w:tcPr>
+          <w:p>
+            <w:pPr>
+              <w:jc w:val="center"/>
+              <w:pBdr>
+                <w:bottom w:val="none" w:sz="0" w:space="0" w:color="000000"/>
+                <w:top w:val="none" w:sz="0" w:space="0" w:color="000000"/>
+                <w:left w:val="none" w:sz="0" w:space="0" w:color="000000"/>
+                <w:right w:val="none" w:sz="0" w:space="0" w:color="000000"/>
+              </w:pBdr>
+              <w:spacing w:after="100" w:before="100" w:line="240"/>
+              <w:ind w:left="100" w:right="100" w:firstLine="0" w:firstLineChars="0"/>
+              <w:rPr>
+                <w:rFonts w:ascii="DejaVu Sans" w:hAnsi="DejaVu Sans" w:eastAsia="DejaVu Sans" w:cs="DejaVu Sans"/>
+                <w:i w:val="false"/>
+                <w:b w:val="false"/>
+                <w:u w:val="none"/>
+                <w:strike w:val="false"/>
+                <w:sz w:val="22"/>
+                <w:szCs w:val="22"/>
+                <w:color w:val="000000"/>
+              </w:rPr>
+            </w:pPr>
+            <w:r xmlns:w="http://schemas.openxmlformats.org/wordprocessingml/2006/main" xmlns:wp="http://schemas.openxmlformats.org/drawingml/2006/wordprocessingDrawing" xmlns:r="http://schemas.openxmlformats.org/officeDocument/2006/relationships" xmlns:w14="http://schemas.microsoft.com/office/word/2010/wordml">
+              <w:rPr>
+                <w:rFonts w:ascii="DejaVu Sans" w:hAnsi="DejaVu Sans" w:eastAsia="DejaVu Sans" w:cs="DejaVu Sans"/>
+                <w:i w:val="false"/>
+                <w:b w:val="false"/>
+                <w:u w:val="none"/>
+                <w:strike w:val="false"/>
+                <w:sz w:val="22"/>
+                <w:szCs w:val="22"/>
+                <w:color w:val="000000"/>
+              </w:rPr>
+              <w:t xml:space="preserve">0.60</w:t>
             </w:r>
           </w:p>
         </w:tc>

</xml_diff>